<commit_message>
Prepare corrected public research package
</commit_message>
<xml_diff>
--- a/reporting/Updated_PRISMA_ScR_Checklist.docx
+++ b/reporting/Updated_PRISMA_ScR_Checklist.docx
@@ -13,7 +13,7 @@
     </w:p>
     <w:p>
       <w:r>
-        <w:t>Checklist mapped to the edited manuscript. Locations refer to the final rendered edited copy. Unverified registration information remains incomplete and is listed in the author queries.</w:t>
+        <w:t>Checklist mapped to the edited manuscript. Locations refer to the final rendered edited copy. The review was not prospectively registered, and no separate protocol was published.</w:t>
       </w:r>
     </w:p>
     <w:tbl>
@@ -623,10 +623,7 @@
           </w:tcPr>
           <w:p>
             <w:r>
-              <w:rPr>
-                <w:sz w:val="14"/>
-              </w:rPr>
-              <w:t>Partial</w:t>
+              <w:t>Yes</w:t>
             </w:r>
           </w:p>
         </w:tc>
@@ -643,9 +640,6 @@
           </w:tcPr>
           <w:p>
             <w:r>
-              <w:rPr>
-                <w:sz w:val="14"/>
-              </w:rPr>
               <w:t>Section 2.1, p. 2</w:t>
             </w:r>
           </w:p>
@@ -663,10 +657,7 @@
           </w:tcPr>
           <w:p>
             <w:r>
-              <w:rPr>
-                <w:sz w:val="14"/>
-              </w:rPr>
-              <w:t>Author confirmation required: provide registration number/link or approve the no-registration statement</w:t>
+              <w:t>The review was not prospectively registered, and no separate protocol was published.</w:t>
             </w:r>
           </w:p>
         </w:tc>

</xml_diff>

<commit_message>
Register retrospective scoping review protocol
</commit_message>
<xml_diff>
--- a/reporting/Updated_PRISMA_ScR_Checklist.docx
+++ b/reporting/Updated_PRISMA_ScR_Checklist.docx
@@ -13,7 +13,7 @@
     </w:p>
     <w:p>
       <w:r>
-        <w:t>Checklist mapped to the edited manuscript. Locations refer to the final rendered edited copy. The review was not prospectively registered, and no separate protocol was published.</w:t>
+        <w:t>Checklist mapped to the edited manuscript. Locations refer to the final rendered edited copy. The review was not prospectively registered. A retrospective protocol was deposited on GitHub on 6 September 2026.</w:t>
       </w:r>
     </w:p>
     <w:tbl>
@@ -657,7 +657,7 @@
           </w:tcPr>
           <w:p>
             <w:r>
-              <w:t>The review was not prospectively registered, and no separate protocol was published.</w:t>
+              <w:t>Retrospective GitHub protocol release dated 6 September 2026; permanent link reported in Section 2.1.</w:t>
             </w:r>
           </w:p>
         </w:tc>

</xml_diff>

<commit_message>
Add prospective protocol for future review update
</commit_message>
<xml_diff>
--- a/reporting/Updated_PRISMA_ScR_Checklist.docx
+++ b/reporting/Updated_PRISMA_ScR_Checklist.docx
@@ -13,7 +13,7 @@
     </w:p>
     <w:p>
       <w:r>
-        <w:t>Checklist mapped to the edited manuscript. Locations refer to the final rendered edited copy. The review was not prospectively registered. A retrospective protocol was deposited on GitHub on 6 September 2026.</w:t>
+        <w:t>Checklist mapped to the edited manuscript. Locations refer to the final rendered edited copy. The original review was not registered before screening. A versioned methods record was deposited on GitHub on 6 September 2026. Protocol version 2.0 applies prospectively only to a future update or replication.</w:t>
       </w:r>
     </w:p>
     <w:tbl>
@@ -657,7 +657,7 @@
           </w:tcPr>
           <w:p>
             <w:r>
-              <w:t>Retrospective GitHub protocol release dated 6 September 2026; permanent link reported in Section 2.1.</w:t>
+              <w:t>GitHub methods record deposited 6 September 2026; prospective protocol version 2.0 applies only to a future update or replication. Repository link reported in Section 2.1.</w:t>
             </w:r>
           </w:p>
         </w:tc>

</xml_diff>